<commit_message>
AB#2 Update README for lab integration test
</commit_message>
<xml_diff>
--- a/report.docx
+++ b/report.docx
@@ -31,6 +31,29 @@
         </w:rPr>
         <w:t>Group 06</w:t>
       </w:r>
+    </w:p>
+    <w:p>
+      <w:pPr>
+        <w:rPr>
+          <w:b/>
+          <w:bCs/>
+        </w:rPr>
+      </w:pPr>
+      <w:r>
+        <w:rPr>
+          <w:b/>
+          <w:bCs/>
+        </w:rPr>
+        <w:t>2026</w:t>
+      </w:r>
+    </w:p>
+    <w:p>
+      <w:pPr>
+        <w:rPr>
+          <w:b/>
+          <w:bCs/>
+        </w:rPr>
+      </w:pPr>
     </w:p>
     <w:p/>
     <w:sectPr>

</xml_diff>